<commit_message>
adding new Docs, Raw Wiki Data, Scripts (SQL & Py)
</commit_message>
<xml_diff>
--- a/Docs/Data Sources.docx
+++ b/Docs/Data Sources.docx
@@ -28,8 +28,16 @@
           <w:ilvl w:val="0"/>
           <w:numId w:val="1"/>
         </w:numPr>
+        <w:rPr>
+          <w:b/>
+          <w:bCs/>
+        </w:rPr>
       </w:pPr>
       <w:r>
+        <w:rPr>
+          <w:b/>
+          <w:bCs/>
+        </w:rPr>
         <w:t>50 Tallest Mountains in Utah – Wikipedia</w:t>
       </w:r>
     </w:p>
@@ -62,16 +70,32 @@
           <w:ilvl w:val="0"/>
           <w:numId w:val="1"/>
         </w:numPr>
+        <w:rPr>
+          <w:b/>
+          <w:bCs/>
+        </w:rPr>
       </w:pPr>
       <w:r>
+        <w:rPr>
+          <w:b/>
+          <w:bCs/>
+        </w:rPr>
         <w:t>Open-</w:t>
       </w:r>
       <w:proofErr w:type="spellStart"/>
       <w:r>
+        <w:rPr>
+          <w:b/>
+          <w:bCs/>
+        </w:rPr>
         <w:t>Meteo</w:t>
       </w:r>
       <w:proofErr w:type="spellEnd"/>
       <w:r>
+        <w:rPr>
+          <w:b/>
+          <w:bCs/>
+        </w:rPr>
         <w:t xml:space="preserve"> (free API)</w:t>
       </w:r>
     </w:p>
@@ -104,8 +128,16 @@
           <w:ilvl w:val="0"/>
           <w:numId w:val="1"/>
         </w:numPr>
+        <w:rPr>
+          <w:b/>
+          <w:bCs/>
+        </w:rPr>
       </w:pPr>
       <w:r>
+        <w:rPr>
+          <w:b/>
+          <w:bCs/>
+        </w:rPr>
         <w:t>Open Weather (free API)</w:t>
       </w:r>
     </w:p>
@@ -138,8 +170,16 @@
           <w:ilvl w:val="0"/>
           <w:numId w:val="1"/>
         </w:numPr>
+        <w:rPr>
+          <w:b/>
+          <w:bCs/>
+        </w:rPr>
       </w:pPr>
       <w:r>
+        <w:rPr>
+          <w:b/>
+          <w:bCs/>
+        </w:rPr>
         <w:t>NOAA Weather API</w:t>
       </w:r>
     </w:p>
@@ -1255,6 +1295,25 @@
       <w:shd w:val="clear" w:color="auto" w:fill="E1DFDD"/>
     </w:rPr>
   </w:style>
+  <w:style w:type="table" w:styleId="TableGrid">
+    <w:name w:val="Table Grid"/>
+    <w:basedOn w:val="TableNormal"/>
+    <w:uiPriority w:val="39"/>
+    <w:rsid w:val="007573F4"/>
+    <w:pPr>
+      <w:spacing w:after="0" w:line="240" w:lineRule="auto"/>
+    </w:pPr>
+    <w:tblPr>
+      <w:tblBorders>
+        <w:top w:val="single" w:sz="4" w:space="0" w:color="auto"/>
+        <w:left w:val="single" w:sz="4" w:space="0" w:color="auto"/>
+        <w:bottom w:val="single" w:sz="4" w:space="0" w:color="auto"/>
+        <w:right w:val="single" w:sz="4" w:space="0" w:color="auto"/>
+        <w:insideH w:val="single" w:sz="4" w:space="0" w:color="auto"/>
+        <w:insideV w:val="single" w:sz="4" w:space="0" w:color="auto"/>
+      </w:tblBorders>
+    </w:tblPr>
+  </w:style>
 </w:styles>
 </file>
 

</xml_diff>

<commit_message>
File cleanup. Updating Readme.
</commit_message>
<xml_diff>
--- a/Docs/Data Sources.docx
+++ b/Docs/Data Sources.docx
@@ -163,49 +163,6 @@
         </w:r>
       </w:hyperlink>
     </w:p>
-    <w:p>
-      <w:pPr>
-        <w:pStyle w:val="ListParagraph"/>
-        <w:numPr>
-          <w:ilvl w:val="0"/>
-          <w:numId w:val="1"/>
-        </w:numPr>
-        <w:rPr>
-          <w:b/>
-          <w:bCs/>
-        </w:rPr>
-      </w:pPr>
-      <w:r>
-        <w:rPr>
-          <w:b/>
-          <w:bCs/>
-        </w:rPr>
-        <w:t>NOAA Weather API</w:t>
-      </w:r>
-    </w:p>
-    <w:p>
-      <w:r>
-        <w:tab/>
-      </w:r>
-      <w:r>
-        <w:rPr>
-          <w:u w:val="single"/>
-        </w:rPr>
-        <w:t>Link</w:t>
-      </w:r>
-      <w:r>
-        <w:t xml:space="preserve">: </w:t>
-      </w:r>
-      <w:hyperlink r:id="rId8" w:history="1">
-        <w:r>
-          <w:rPr>
-            <w:rStyle w:val="Hyperlink"/>
-          </w:rPr>
-          <w:t>https://api.weather.gov/</w:t>
-        </w:r>
-      </w:hyperlink>
-    </w:p>
-    <w:p/>
     <w:sectPr>
       <w:pgSz w:w="12240" w:h="15840"/>
       <w:pgMar w:top="1440" w:right="1440" w:bottom="1440" w:left="1440" w:header="720" w:footer="720" w:gutter="0"/>

</xml_diff>